<commit_message>
Entrega final: Frontend y API independientes
</commit_message>
<xml_diff>
--- a/rest-gourmet-api/Nuevo Documento de Microsoft Word.docx
+++ b/rest-gourmet-api/Nuevo Documento de Microsoft Word.docx
@@ -6734,6 +6734,140 @@
         </w:tc>
       </w:tr>
     </w:tbl>
+    <w:p>
+      <w:pPr>
+        <w:rPr>
+          <w:rFonts w:ascii="Arial" w:hAnsi="Arial" w:cs="Arial"/>
+        </w:rPr>
+      </w:pPr>
+    </w:p>
+    <w:p>
+      <w:pPr>
+        <w:rPr>
+          <w:rFonts w:ascii="Arial" w:hAnsi="Arial" w:cs="Arial"/>
+        </w:rPr>
+      </w:pPr>
+      <w:r>
+        <w:rPr>
+          <w:rFonts w:ascii="Arial" w:hAnsi="Arial" w:cs="Arial"/>
+          <w:b/>
+          <w:bCs/>
+        </w:rPr>
+        <w:t>Tecnologías de Implementación</w:t>
+      </w:r>
+    </w:p>
+    <w:p>
+      <w:pPr>
+        <w:rPr>
+          <w:rFonts w:ascii="Arial" w:hAnsi="Arial" w:cs="Arial"/>
+        </w:rPr>
+      </w:pPr>
+      <w:r>
+        <w:rPr>
+          <w:rFonts w:ascii="Arial" w:hAnsi="Arial" w:cs="Arial"/>
+          <w:b/>
+          <w:bCs/>
+        </w:rPr>
+        <w:t>Motor:</w:t>
+      </w:r>
+      <w:r>
+        <w:rPr>
+          <w:rFonts w:ascii="Arial" w:hAnsi="Arial" w:cs="Arial"/>
+        </w:rPr>
+        <w:t xml:space="preserve"> Node.js v18+</w:t>
+      </w:r>
+    </w:p>
+    <w:p>
+      <w:pPr>
+        <w:rPr>
+          <w:rFonts w:ascii="Arial" w:hAnsi="Arial" w:cs="Arial"/>
+        </w:rPr>
+      </w:pPr>
+      <w:r>
+        <w:rPr>
+          <w:rFonts w:ascii="Arial" w:hAnsi="Arial" w:cs="Arial"/>
+          <w:b/>
+          <w:bCs/>
+        </w:rPr>
+        <w:t>Framework:</w:t>
+      </w:r>
+      <w:r>
+        <w:rPr>
+          <w:rFonts w:ascii="Arial" w:hAnsi="Arial" w:cs="Arial"/>
+        </w:rPr>
+        <w:t xml:space="preserve"> Express.js</w:t>
+      </w:r>
+    </w:p>
+    <w:p>
+      <w:pPr>
+        <w:rPr>
+          <w:rFonts w:ascii="Arial" w:hAnsi="Arial" w:cs="Arial"/>
+        </w:rPr>
+      </w:pPr>
+      <w:r>
+        <w:rPr>
+          <w:rFonts w:ascii="Arial" w:hAnsi="Arial" w:cs="Arial"/>
+          <w:b/>
+          <w:bCs/>
+        </w:rPr>
+        <w:t>Formato de datos:</w:t>
+      </w:r>
+      <w:r>
+        <w:rPr>
+          <w:rFonts w:ascii="Arial" w:hAnsi="Arial" w:cs="Arial"/>
+        </w:rPr>
+        <w:t xml:space="preserve"> JSON</w:t>
+      </w:r>
+    </w:p>
+    <w:p>
+      <w:pPr>
+        <w:rPr>
+          <w:rFonts w:ascii="Arial" w:hAnsi="Arial" w:cs="Arial"/>
+        </w:rPr>
+      </w:pPr>
+      <w:r>
+        <w:rPr>
+          <w:rFonts w:ascii="Arial" w:hAnsi="Arial" w:cs="Arial"/>
+          <w:b/>
+          <w:bCs/>
+        </w:rPr>
+        <w:t>Persistencia:</w:t>
+      </w:r>
+      <w:r>
+        <w:rPr>
+          <w:rFonts w:ascii="Arial" w:hAnsi="Arial" w:cs="Arial"/>
+        </w:rPr>
+        <w:t xml:space="preserve"> File-</w:t>
+      </w:r>
+      <w:proofErr w:type="spellStart"/>
+      <w:r>
+        <w:rPr>
+          <w:rFonts w:ascii="Arial" w:hAnsi="Arial" w:cs="Arial"/>
+        </w:rPr>
+        <w:t>based</w:t>
+      </w:r>
+      <w:proofErr w:type="spellEnd"/>
+      <w:r>
+        <w:rPr>
+          <w:rFonts w:ascii="Arial" w:hAnsi="Arial" w:cs="Arial"/>
+        </w:rPr>
+        <w:t xml:space="preserve"> DB (data/*.</w:t>
+      </w:r>
+      <w:proofErr w:type="spellStart"/>
+      <w:r>
+        <w:rPr>
+          <w:rFonts w:ascii="Arial" w:hAnsi="Arial" w:cs="Arial"/>
+        </w:rPr>
+        <w:t>json</w:t>
+      </w:r>
+      <w:proofErr w:type="spellEnd"/>
+      <w:r>
+        <w:rPr>
+          <w:rFonts w:ascii="Arial" w:hAnsi="Arial" w:cs="Arial"/>
+        </w:rPr>
+        <w:t>)</w:t>
+      </w:r>
+    </w:p>
     <w:p>
       <w:pPr>
         <w:rPr>

</xml_diff>